<commit_message>
HCP-PRE docs v2: fix voorbeeldbox titles, remove domain labels, update EMA text
- Voorbeeldbox: title format → "Voorbeeld — Deel X: ..." (removed Nadia ref);
  added toptitle=3pt/bottomtitle=3pt to eliminate white space above title
- Deel 4 goals: removed "(domein: ...)" annotations from all contextboxes
  across all 10 cases — goals now show only the abstract label
- "Na 21 dagen EMA-monitoring" → "Na voldoende EMA-monitoring" (less rigid)
- Word docs: time table column widths fixed (Stap/Klinische taak/Wat u doet/
  Richttijd now have explicit widths 1.3/4.0/8.7/2.0 cm)
- Word docs: example box titles updated to "Voorbeeld — Deel X" format
- Regenerated all 15 PDFs and Word docs (5×2-case + 10×1-case)

Co-Authored-By: Claude Sonnet 4.6 <noreply@anthropic.com>
</commit_message>
<xml_diff>
--- a/evaluation/qualtrics/01_HCPs_PRE/separate_HCPs/1_case_per_HCP/HCP_01/main.docx
+++ b/evaluation/qualtrics/01_HCPs_PRE/separate_HCPs/1_case_per_HCP/HCP_01/main.docx
@@ -749,7 +749,7 @@
               <w:rPr>
                 <w:sz w:val="19"/>
               </w:rPr>
-              <w:t>Na 21 dagen EMA-monitoring construeert PHOENIX een bipartiet netwerk: een graaf met twee kolommensets en gewogen verbindingen daartussen.</w:t>
+              <w:t>Na voldoende EMA-monitoring construeert PHOENIX een bipartiet netwerk: een graaf met twee kolommensets en gewogen verbindingen daartussen.</w:t>
             </w:r>
           </w:p>
           <w:p>
@@ -826,7 +826,7 @@
       <w:tr>
         <w:tc>
           <w:tcPr>
-            <w:tcW w:type="dxa" w:w="2436"/>
+            <w:tcW w:type="dxa" w:w="737"/>
           </w:tcPr>
           <w:p>
             <w:r>
@@ -840,7 +840,7 @@
         </w:tc>
         <w:tc>
           <w:tcPr>
-            <w:tcW w:type="dxa" w:w="2436"/>
+            <w:tcW w:type="dxa" w:w="2268"/>
           </w:tcPr>
           <w:p>
             <w:r>
@@ -854,7 +854,7 @@
         </w:tc>
         <w:tc>
           <w:tcPr>
-            <w:tcW w:type="dxa" w:w="2436"/>
+            <w:tcW w:type="dxa" w:w="4932"/>
           </w:tcPr>
           <w:p>
             <w:r>
@@ -868,7 +868,7 @@
         </w:tc>
         <w:tc>
           <w:tcPr>
-            <w:tcW w:type="dxa" w:w="2436"/>
+            <w:tcW w:type="dxa" w:w="1134"/>
           </w:tcPr>
           <w:p>
             <w:r>
@@ -884,7 +884,7 @@
       <w:tr>
         <w:tc>
           <w:tcPr>
-            <w:tcW w:type="dxa" w:w="2436"/>
+            <w:tcW w:type="dxa" w:w="737"/>
           </w:tcPr>
           <w:p>
             <w:r>
@@ -897,7 +897,7 @@
         </w:tc>
         <w:tc>
           <w:tcPr>
-            <w:tcW w:type="dxa" w:w="2436"/>
+            <w:tcW w:type="dxa" w:w="2268"/>
           </w:tcPr>
           <w:p>
             <w:r>
@@ -910,7 +910,7 @@
         </w:tc>
         <w:tc>
           <w:tcPr>
-            <w:tcW w:type="dxa" w:w="2436"/>
+            <w:tcW w:type="dxa" w:w="4932"/>
           </w:tcPr>
           <w:p>
             <w:r>
@@ -923,7 +923,7 @@
         </w:tc>
         <w:tc>
           <w:tcPr>
-            <w:tcW w:type="dxa" w:w="2436"/>
+            <w:tcW w:type="dxa" w:w="1134"/>
           </w:tcPr>
           <w:p>
             <w:r>
@@ -938,7 +938,7 @@
       <w:tr>
         <w:tc>
           <w:tcPr>
-            <w:tcW w:type="dxa" w:w="2436"/>
+            <w:tcW w:type="dxa" w:w="737"/>
           </w:tcPr>
           <w:p>
             <w:r>
@@ -951,7 +951,7 @@
         </w:tc>
         <w:tc>
           <w:tcPr>
-            <w:tcW w:type="dxa" w:w="2436"/>
+            <w:tcW w:type="dxa" w:w="2268"/>
           </w:tcPr>
           <w:p>
             <w:r>
@@ -964,7 +964,7 @@
         </w:tc>
         <w:tc>
           <w:tcPr>
-            <w:tcW w:type="dxa" w:w="2436"/>
+            <w:tcW w:type="dxa" w:w="4932"/>
           </w:tcPr>
           <w:p>
             <w:r>
@@ -977,7 +977,7 @@
         </w:tc>
         <w:tc>
           <w:tcPr>
-            <w:tcW w:type="dxa" w:w="2436"/>
+            <w:tcW w:type="dxa" w:w="1134"/>
           </w:tcPr>
           <w:p>
             <w:r>
@@ -992,7 +992,7 @@
       <w:tr>
         <w:tc>
           <w:tcPr>
-            <w:tcW w:type="dxa" w:w="2436"/>
+            <w:tcW w:type="dxa" w:w="737"/>
           </w:tcPr>
           <w:p>
             <w:r>
@@ -1005,7 +1005,7 @@
         </w:tc>
         <w:tc>
           <w:tcPr>
-            <w:tcW w:type="dxa" w:w="2436"/>
+            <w:tcW w:type="dxa" w:w="2268"/>
           </w:tcPr>
           <w:p>
             <w:r>
@@ -1018,7 +1018,7 @@
         </w:tc>
         <w:tc>
           <w:tcPr>
-            <w:tcW w:type="dxa" w:w="2436"/>
+            <w:tcW w:type="dxa" w:w="4932"/>
           </w:tcPr>
           <w:p>
             <w:r>
@@ -1031,7 +1031,7 @@
         </w:tc>
         <w:tc>
           <w:tcPr>
-            <w:tcW w:type="dxa" w:w="2436"/>
+            <w:tcW w:type="dxa" w:w="1134"/>
           </w:tcPr>
           <w:p>
             <w:r>
@@ -1046,7 +1046,7 @@
       <w:tr>
         <w:tc>
           <w:tcPr>
-            <w:tcW w:type="dxa" w:w="2436"/>
+            <w:tcW w:type="dxa" w:w="737"/>
           </w:tcPr>
           <w:p>
             <w:r>
@@ -1059,7 +1059,7 @@
         </w:tc>
         <w:tc>
           <w:tcPr>
-            <w:tcW w:type="dxa" w:w="2436"/>
+            <w:tcW w:type="dxa" w:w="2268"/>
           </w:tcPr>
           <w:p>
             <w:r>
@@ -1072,7 +1072,7 @@
         </w:tc>
         <w:tc>
           <w:tcPr>
-            <w:tcW w:type="dxa" w:w="2436"/>
+            <w:tcW w:type="dxa" w:w="4932"/>
           </w:tcPr>
           <w:p>
             <w:r>
@@ -1085,7 +1085,7 @@
         </w:tc>
         <w:tc>
           <w:tcPr>
-            <w:tcW w:type="dxa" w:w="2436"/>
+            <w:tcW w:type="dxa" w:w="1134"/>
           </w:tcPr>
           <w:p>
             <w:r>
@@ -1100,7 +1100,7 @@
       <w:tr>
         <w:tc>
           <w:tcPr>
-            <w:tcW w:type="dxa" w:w="2436"/>
+            <w:tcW w:type="dxa" w:w="737"/>
           </w:tcPr>
           <w:p>
             <w:r>
@@ -1113,7 +1113,7 @@
         </w:tc>
         <w:tc>
           <w:tcPr>
-            <w:tcW w:type="dxa" w:w="2436"/>
+            <w:tcW w:type="dxa" w:w="2268"/>
           </w:tcPr>
           <w:p>
             <w:r>
@@ -1126,7 +1126,7 @@
         </w:tc>
         <w:tc>
           <w:tcPr>
-            <w:tcW w:type="dxa" w:w="2436"/>
+            <w:tcW w:type="dxa" w:w="4932"/>
           </w:tcPr>
           <w:p>
             <w:r>
@@ -1139,7 +1139,7 @@
         </w:tc>
         <w:tc>
           <w:tcPr>
-            <w:tcW w:type="dxa" w:w="2436"/>
+            <w:tcW w:type="dxa" w:w="1134"/>
           </w:tcPr>
           <w:p>
             <w:r>
@@ -1154,7 +1154,7 @@
       <w:tr>
         <w:tc>
           <w:tcPr>
-            <w:tcW w:type="dxa" w:w="2436"/>
+            <w:tcW w:type="dxa" w:w="737"/>
           </w:tcPr>
           <w:p>
             <w:r>
@@ -1167,7 +1167,7 @@
         </w:tc>
         <w:tc>
           <w:tcPr>
-            <w:tcW w:type="dxa" w:w="2436"/>
+            <w:tcW w:type="dxa" w:w="2268"/>
           </w:tcPr>
           <w:p>
             <w:r>
@@ -1180,7 +1180,7 @@
         </w:tc>
         <w:tc>
           <w:tcPr>
-            <w:tcW w:type="dxa" w:w="2436"/>
+            <w:tcW w:type="dxa" w:w="4932"/>
           </w:tcPr>
           <w:p>
             <w:r>
@@ -1193,7 +1193,7 @@
         </w:tc>
         <w:tc>
           <w:tcPr>
-            <w:tcW w:type="dxa" w:w="2436"/>
+            <w:tcW w:type="dxa" w:w="1134"/>
           </w:tcPr>
           <w:p>
             <w:r>
@@ -1208,7 +1208,7 @@
       <w:tr>
         <w:tc>
           <w:tcPr>
-            <w:tcW w:type="dxa" w:w="2436"/>
+            <w:tcW w:type="dxa" w:w="737"/>
           </w:tcPr>
           <w:p>
             <w:r>
@@ -1221,7 +1221,7 @@
         </w:tc>
         <w:tc>
           <w:tcPr>
-            <w:tcW w:type="dxa" w:w="2436"/>
+            <w:tcW w:type="dxa" w:w="2268"/>
           </w:tcPr>
           <w:p>
             <w:r>
@@ -1235,7 +1235,7 @@
         </w:tc>
         <w:tc>
           <w:tcPr>
-            <w:tcW w:type="dxa" w:w="2436"/>
+            <w:tcW w:type="dxa" w:w="4932"/>
           </w:tcPr>
           <w:p>
             <w:r>
@@ -1248,7 +1248,7 @@
         </w:tc>
         <w:tc>
           <w:tcPr>
-            <w:tcW w:type="dxa" w:w="2436"/>
+            <w:tcW w:type="dxa" w:w="1134"/>
           </w:tcPr>
           <w:p>
             <w:r>
@@ -1513,7 +1513,7 @@
                 <w:color w:val="6D28D9"/>
                 <w:sz w:val="20"/>
               </w:rPr>
-              <w:t>Uitgewerkt voorbeeld – Deel 1 – Nadia (38-jarige verpleegkundige)  |  Hoe formuleert u een correct symptoomlabel?</w:t>
+              <w:t>Voorbeeld — Deel 1: Operationalisering  |  Hoe formuleert u een correct symptoomlabel?</w:t>
             </w:r>
           </w:p>
           <w:p>
@@ -1990,7 +1990,7 @@
                 <w:color w:val="6D28D9"/>
                 <w:sz w:val="20"/>
               </w:rPr>
-              <w:t>Uitgewerkt voorbeeld – Deel 2 – Nadia (38-jarige verpleegkundige)  |  Hoe genereert u behandelingsoptielabels?</w:t>
+              <w:t>Voorbeeld — Deel 2: Initieel observatiemodel  |  Hoe genereert u behandelingsoptielabels?</w:t>
             </w:r>
           </w:p>
           <w:p>
@@ -2537,7 +2537,7 @@
                 <w:color w:val="6D28D9"/>
                 <w:sz w:val="20"/>
               </w:rPr>
-              <w:t>Uitgewerkt voorbeeld – Deel 3 – Nadia (38-jarige verpleegkundige)  |  Hoe leest u het netwerk en rangschikt u de behandelingsopties?</w:t>
+              <w:t>Voorbeeld — Deel 3: Behandeldoelprioritering  |  Hoe leest u het netwerk en rangschikt u de behandelingsopties?</w:t>
             </w:r>
           </w:p>
           <w:p>
@@ -3268,7 +3268,7 @@
                 <w:color w:val="6D28D9"/>
                 <w:sz w:val="20"/>
               </w:rPr>
-              <w:t>Uitgewerkt voorbeeld – Deel 4 – Nadia (38-jarige verpleegkundige)  |  Hoe selecteert u de meest passende EMA-items per behandeldoel?</w:t>
+              <w:t>Voorbeeld — Deel 4: Verfijnd observatiemodel  |  Hoe selecteert u de meest passende EMA-items per behandeldoel?</w:t>
             </w:r>
           </w:p>
           <w:p>
@@ -4411,7 +4411,7 @@
                 <w:color w:val="6D28D9"/>
                 <w:sz w:val="20"/>
               </w:rPr>
-              <w:t>Uitgewerkt voorbeeld – Deel 5 – Nadia (38-jarige verpleegkundige)  |  Hoe formuleert u een effectieve coachingsboodschap?</w:t>
+              <w:t>Voorbeeld — Deel 5: Mobiele coaching  |  Hoe formuleert u een effectieve coachingsboodschap?</w:t>
             </w:r>
           </w:p>
           <w:p>

</xml_diff>

<commit_message>
HCP PRE 1-case: label responseboxes Deel 1–5 + Reflectievraag a/b/c; fix EMA items, goal names, Deel 6 structure, tweedelig; update all DOCX+PDF
- responsebox now accepts optional title param; all 8 per file labeled "Uw antwoord -- Deel X" / "Uw antwoord -- Reflectievraag a/b/c"
- DOCX Deel 4 heading updated; Deel 5 title renamed; Deel 6 split into 3 separate answer sections
- Goal names renamed to single-concept labels across all 10 HCPs
- EMA lists: 6 correct (2/goal) + 14 distractors from unrelated biopsychosocial domains
- bipartiet → tweedelig throughout; netwerkanalyse defined in EMA instrbox
- All 10 PDFs recompiled

Co-Authored-By: Claude Sonnet 4.6 <noreply@anthropic.com>
</commit_message>
<xml_diff>
--- a/evaluation/qualtrics/01_HCPs_PRE/separate_HCPs/1_case_per_HCP/HCP_01/main.docx
+++ b/evaluation/qualtrics/01_HCPs_PRE/separate_HCPs/1_case_per_HCP/HCP_01/main.docx
@@ -738,7 +738,7 @@
                 <w:color w:val="475569"/>
                 <w:sz w:val="20"/>
               </w:rPr>
-              <w:t>Het bipartiet netwerk: structuur van het observatiemodel</w:t>
+              <w:t>Het tweedelig netwerk: structuur van het observatiemodel</w:t>
             </w:r>
           </w:p>
           <w:p>
@@ -749,7 +749,7 @@
               <w:rPr>
                 <w:sz w:val="19"/>
               </w:rPr>
-              <w:t>Na voldoende EMA-monitoring construeert PHOENIX een bipartiet netwerk: een graaf met twee kolommensets en gewogen verbindingen daartussen.</w:t>
+              <w:t>Na voldoende EMA-monitoring construeert PHOENIX een tweedelig netwerk: een graaf met twee kolommensets en gewogen verbindingen daartussen.</w:t>
             </w:r>
           </w:p>
           <w:p>
@@ -1851,7 +1851,7 @@
         <w:rPr>
           <w:color w:val="1E3A5F"/>
         </w:rPr>
-        <w:t>3  Deel 2: Initieel observatiemodel (bipartiet netwerk)</w:t>
+        <w:t>3  Deel 2: Initieel observatiemodel (tweedelig netwerk)</w:t>
       </w:r>
     </w:p>
     <w:tbl>
@@ -2386,7 +2386,7 @@
         <w:rPr>
           <w:color w:val="1E3A5F"/>
         </w:rPr>
-        <w:t>4  Deel 3: Behandeldoelprioritering via het bipartiet netwerk</w:t>
+        <w:t>4  Deel 3: Behandeldoelprioritering via het tweedelig netwerk</w:t>
       </w:r>
     </w:p>
     <w:tbl>
@@ -2449,7 +2449,7 @@
               <w:rPr>
                 <w:sz w:val="19"/>
               </w:rPr>
-              <w:t>Bipartiet netwerk lezen:</w:t>
+              <w:t>Tweedelig netwerk lezen:</w:t>
             </w:r>
           </w:p>
           <w:p>
@@ -2560,7 +2560,7 @@
               <w:rPr>
                 <w:sz w:val="19"/>
               </w:rPr>
-              <w:t>Bipartiet netwerk (voorbeeld – blauw = positief, rood = negatief):</w:t>
+              <w:t>Tweedelig netwerk (voorbeeld – blauw = positief, rood = negatief):</w:t>
             </w:r>
           </w:p>
           <w:p>
@@ -2767,7 +2767,7 @@
                 <w:color w:val="475569"/>
                 <w:sz w:val="20"/>
               </w:rPr>
-              <w:t>Bipartiet netwerk</w:t>
+              <w:t>Tweedelig netwerk</w:t>
             </w:r>
           </w:p>
           <w:p>
@@ -2778,7 +2778,7 @@
               <w:rPr>
                 <w:sz w:val="19"/>
               </w:rPr>
-              <w:t>Bipartiet netwerk (blauw = positief verband; rood = negatief verband):</w:t>
+              <w:t>Tweedelig netwerk (blauw = positief verband; rood = negatief verband):</w:t>
             </w:r>
           </w:p>
           <w:p>
@@ -3456,88 +3456,43 @@
                 <w:color w:val="047857"/>
                 <w:sz w:val="20"/>
               </w:rPr>
-              <w:t>Gestandaardiseerde behandeldoelen (abstract)</w:t>
+              <w:t>Gestandaardiseerde behandeldoelen (abstract) voor Deel 4:</w:t>
             </w:r>
           </w:p>
           <w:p>
             <w:pPr>
-              <w:spacing w:before="0" w:after="20"/>
+              <w:spacing w:before="20" w:after="20"/>
             </w:pPr>
             <w:r>
               <w:rPr>
-                <w:sz w:val="19"/>
-              </w:rPr>
-              <w:t>1.24</w:t>
+                <w:b/>
+                <w:sz w:val="20"/>
+              </w:rPr>
+              <w:t xml:space="preserve">1.  Slaapkwaliteit</w:t>
             </w:r>
           </w:p>
           <w:p>
             <w:pPr>
-              <w:spacing w:before="0" w:after="20"/>
+              <w:spacing w:before="20" w:after="20"/>
             </w:pPr>
             <w:r>
               <w:rPr>
-                <w:sz w:val="19"/>
-              </w:rPr>
-              <w:t>tabular[t]@&gt;p0.27&gt;p0.67@</w:t>
+                <w:b/>
+                <w:sz w:val="20"/>
+              </w:rPr>
+              <w:t xml:space="preserve">2.  Cognitieve ontlading</w:t>
             </w:r>
           </w:p>
           <w:p>
             <w:pPr>
-              <w:spacing w:before="0" w:after="20"/>
+              <w:spacing w:before="20" w:after="20"/>
             </w:pPr>
             <w:r>
               <w:rPr>
-                <w:sz w:val="19"/>
-              </w:rPr>
-              <w:t xml:space="preserve">Primair probleem &amp; Moeizaam inslapen door een overactieve geest en aanhoudende spanning in de avond. </w:t>
-            </w:r>
-          </w:p>
-          <w:p/>
-          <w:p>
-            <w:pPr>
-              <w:spacing w:before="0" w:after="20"/>
-            </w:pPr>
-            <w:r>
-              <w:rPr>
-                <w:sz w:val="19"/>
-              </w:rPr>
-              <w:t xml:space="preserve">Behandeldoel &amp; Schermtijd in de late avond reduceren en een vaste afschakelroutine installeren. </w:t>
-            </w:r>
-          </w:p>
-          <w:p/>
-          <w:p>
-            <w:pPr>
-              <w:spacing w:before="0" w:after="20"/>
-            </w:pPr>
-            <w:r>
-              <w:rPr>
-                <w:sz w:val="19"/>
-              </w:rPr>
-              <w:t xml:space="preserve">Voornaamste barriere &amp; Lage zelfeffectiviteit: schermgebruik voelt als de enige haalbare manier om na het werk te decomprimeren. </w:t>
-            </w:r>
-          </w:p>
-          <w:p/>
-          <w:p>
-            <w:pPr>
-              <w:spacing w:before="0" w:after="20"/>
-            </w:pPr>
-            <w:r>
-              <w:rPr>
-                <w:sz w:val="19"/>
-              </w:rPr>
-              <w:t xml:space="preserve">Copingstrategie &amp; Implementatie-intentie met substitutie: vervang de laatste 30 minuten schermtijd door een korte schrijf- of bewegingsroutine voor het slapengaan. </w:t>
-            </w:r>
-          </w:p>
-          <w:p/>
-          <w:p>
-            <w:pPr>
-              <w:spacing w:before="0" w:after="20"/>
-            </w:pPr>
-            <w:r>
-              <w:rPr>
-                <w:sz w:val="19"/>
-              </w:rPr>
-              <w:t>tabular</w:t>
+                <w:b/>
+                <w:sz w:val="20"/>
+              </w:rPr>
+              <w:t xml:space="preserve">3.  Lichamelijke activiteit</w:t>
             </w:r>
           </w:p>
         </w:tc>
@@ -3556,7 +3511,7 @@
           <w:color w:val="000000"/>
           <w:sz w:val="20"/>
         </w:rPr>
-        <w:t>Opdracht: selecteer exact 6 EMA-items (2 per behandeldoel). Omcirkel of markeer de vakjes (☐) in dit Word-document, of typ een X bij de geselecteerde items.</w:t>
+        <w:t>Uw antwoord – Deel 4: selecteer exact 6 EMA-items (2 per behandeldoel). Omcirkel of markeer de vakjes (☐) in dit Word-document, of typ een X bij de geselecteerde items.</w:t>
       </w:r>
     </w:p>
     <w:p/>
@@ -3623,7 +3578,7 @@
               <w:rPr>
                 <w:sz w:val="18"/>
               </w:rPr>
-              <w:t>Schermvrij interval direct voor slapengaan (min)</w:t>
+              <w:t>Waterinname vandaag (glazen)</w:t>
             </w:r>
           </w:p>
         </w:tc>
@@ -3651,7 +3606,7 @@
               <w:rPr>
                 <w:sz w:val="18"/>
               </w:rPr>
-              <w:t>Cafeine-inname na 15.00 uur (aantal dranken)</w:t>
+              <w:t>Medicatie op voorgeschreven tijdstip ingenomen (ja/nee)</w:t>
             </w:r>
           </w:p>
         </w:tc>
@@ -3735,7 +3690,7 @@
               <w:rPr>
                 <w:sz w:val="18"/>
               </w:rPr>
-              <w:t>Bewust sociaal contact gezocht of beantwoord vandaag (ja/nee)</w:t>
+              <w:t>Gesprek met vertrouwenspersoon of steunfiguur gevoerd vandaag (ja/nee)</w:t>
             </w:r>
           </w:p>
         </w:tc>
@@ -3791,7 +3746,7 @@
               <w:rPr>
                 <w:sz w:val="18"/>
               </w:rPr>
-              <w:t>Ochtendlichtblootstelling buiten in de ochtend (min)</w:t>
+              <w:t>Alcoholconsumptie vanavond (eenheden)</w:t>
             </w:r>
           </w:p>
         </w:tc>
@@ -3847,7 +3802,7 @@
               <w:rPr>
                 <w:sz w:val="18"/>
               </w:rPr>
-              <w:t>Alcoholinname vanavond (eenheden)</w:t>
+              <w:t>Omega-3- of vitamine-D-supplement ingenomen (ja/nee)</w:t>
             </w:r>
           </w:p>
         </w:tc>
@@ -3903,7 +3858,7 @@
               <w:rPr>
                 <w:sz w:val="18"/>
               </w:rPr>
-              <w:t>Werkuren vandaag (uren)</w:t>
+              <w:t>Lichttherapielamp of wekker op licht gebruikt in de ochtend (ja/nee)</w:t>
             </w:r>
           </w:p>
         </w:tc>
@@ -3931,7 +3886,7 @@
               <w:rPr>
                 <w:sz w:val="18"/>
               </w:rPr>
-              <w:t>Waterinname vandaag (glazen)</w:t>
+              <w:t>Gebalanceerde maaltijden op vaste tijden genuttigd vandaag (ja/nee)</w:t>
             </w:r>
           </w:p>
         </w:tc>
@@ -3959,7 +3914,7 @@
               <w:rPr>
                 <w:sz w:val="18"/>
               </w:rPr>
-              <w:t>Middagdutje genomen (ja/nee)</w:t>
+              <w:t>Professioneel consult of therapeutische sessie bijgewoond vandaag (ja/nee)</w:t>
             </w:r>
           </w:p>
         </w:tc>
@@ -3987,7 +3942,7 @@
               <w:rPr>
                 <w:sz w:val="18"/>
               </w:rPr>
-              <w:t>Geplande sociale activiteit bijgewoond of geinitieerd (ja/nee)</w:t>
+              <w:t>Schermvrij interval direct voor slapengaan (min)</w:t>
             </w:r>
           </w:p>
         </w:tc>
@@ -4015,7 +3970,7 @@
               <w:rPr>
                 <w:sz w:val="18"/>
               </w:rPr>
-              <w:t>Bewuste ontspanningsoefening of ademhaling in avond uitgevoerd (min)</w:t>
+              <w:t>Sigaretten of tabak gerookt vandaag (aantal)</w:t>
             </w:r>
           </w:p>
         </w:tc>
@@ -4043,7 +3998,7 @@
               <w:rPr>
                 <w:sz w:val="18"/>
               </w:rPr>
-              <w:t>Maaltijd op vaste tijden genuttigd (ja/nee)</w:t>
+              <w:t>Financiele zorgen of administratieve taken aangepakt vandaag (ja/nee)</w:t>
             </w:r>
           </w:p>
         </w:tc>
@@ -4071,7 +4026,7 @@
               <w:rPr>
                 <w:sz w:val="18"/>
               </w:rPr>
-              <w:t>Stappentelling overdag (stappen)</w:t>
+              <w:t>Bewust dankbaarheidsoefening of positieve reflectie uitgevoerd vandaag (ja/nee)</w:t>
             </w:r>
           </w:p>
         </w:tc>
@@ -4099,7 +4054,7 @@
               <w:rPr>
                 <w:sz w:val="18"/>
               </w:rPr>
-              <w:t>Werkgerelateerde taken afgesloten en bewust losgekoppeld na werktijd (ja/nee)</w:t>
+              <w:t>Werkpauzes op vaste tijden genomen vandaag (ja/nee)</w:t>
             </w:r>
           </w:p>
         </w:tc>
@@ -4127,7 +4082,7 @@
               <w:rPr>
                 <w:sz w:val="18"/>
               </w:rPr>
-              <w:t>Schermvrije werkpauze genomen tijdens werkdag (min)</w:t>
+              <w:t>Pijnklachten of lichamelijke ongemakken bijgehouden in een dagboek (ja/nee)</w:t>
             </w:r>
           </w:p>
         </w:tc>
@@ -4155,7 +4110,7 @@
               <w:rPr>
                 <w:sz w:val="18"/>
               </w:rPr>
-              <w:t>Professioneel herstelmoment (hobby, buiten, creatief) uitgevoerd in avond (min)</w:t>
+              <w:t>Betekenisvolle of waardegerichte activiteit ondernomen vandaag (ja/nee)</w:t>
             </w:r>
           </w:p>
         </w:tc>
@@ -4530,7 +4485,7 @@
                 <w:color w:val="6D28D9"/>
                 <w:sz w:val="20"/>
               </w:rPr>
-              <w:t>Uw coachingsboodschap</w:t>
+              <w:t>Uw antwoord – Deel 5: coachingsboodschap</w:t>
             </w:r>
           </w:p>
           <w:p>
@@ -4597,6 +4552,188 @@
       </w:tr>
     </w:tbl>
     <w:p/>
+    <w:p>
+      <w:r>
+        <w:br w:type="page"/>
+      </w:r>
+    </w:p>
+    <w:p>
+      <w:pPr>
+        <w:pStyle w:val="Heading1"/>
+      </w:pPr>
+      <w:r>
+        <w:t>7  Deel 6: Reflectie op digitale benaderingslogica</w:t>
+      </w:r>
+    </w:p>
+    <w:tbl>
+      <w:tblPr>
+        <w:tblW w:w="9026" w:type="dxa"/>
+      </w:tblPr>
+      <w:tr>
+        <w:tc>
+          <w:p>
+            <w:r>
+              <w:rPr>
+                <w:b/>
+              </w:rPr>
+              <w:t>Instructies Deel 6 – Drie reflectievragen (a, b, c)</w:t>
+            </w:r>
+          </w:p>
+          <w:p>
+            <w:r>
+              <w:t xml:space="preserve">Context – de PHOENIX-benaderingslogica:
+PHOENIX verwerkt een vrije klachttekst via vijf opeenvolgende stappen: (1) identificatie van klacht- en toestandsdimensies als meetbare symptomen, (2) generatie van modificeerbare gedragsvariabelen (behandelingsopties), (3) prioritering op basis van een tweedelig netwerk dat op dagelijkse EMA-data wordt gefit, (4) selectie van concrete EMA-meetitems per behandeldoel, en (5) formulering van een gepersonaliseerde dagelijkse coachingsboodschap.
+De kern van deze aanpak is symptoomgedreven netwerk-analyse: klachten worden niet als uitingen van een vaste stoornis beschouwd, maar als dynamische knooppunten in een netwerk van onderling samenhangende toestandsdimensies. Behandelprioriteiten worden niet klinisch verondersteld, maar empirisch bepaald op basis van de gemeten verbanden tussen dagelijks gedrag (behandelingsopties) en klachtniveaus (symptomen) over de tijd.
+Hypothetische situatie:
+Stelt u zich voor dat u als zorgprofessional een vrije klachttekst ontvangt van een persoon met psychische klachten. U beschikt uitsluitend over twee middelen:
+• een mobiele applicatie waarmee de persoon elke dag een korte set vragen beantwoordt (bijv. ja/nee, 0–10 schaal, aantal, minuten) – een EMA-design met dagelijkse datacollectie,
+• een dagelijks digitaal bericht dat u – of een geautomatiseerd systeem – naar de persoon stuurt (zoals u in Deel 5 formuleerde).
+U heeft geen directe consulten, telefoongesprekken of andere contactvormen ter beschikking. Alleen dagelijkse datacollectie via de app en een dagelijkse geschreven boodschap.
+Reflectievraag:
+Hoe zou u, als zorgprofessional, te werk gaan in deze situatie? Beschrijf zo concreet mogelijk uw benaderingslogica:
+a. Welke informatie zou u via de dagelijkse EMA-vragen willen verzamelen, en hoe zou u die selectie bepalen op basis van de vrije klachttekst?
+b. Hoe zou u de dagelijkse boodschappen inhoudelijk afstemmen op wat u via de EMA-data geleidelijk leert over de toestand en het gedrag van de persoon?
+c. Zou u uw digitale aanpak systematisch bijsturen naarmate meer data beschikbaar wordt? Zo ja – op basis van welke criteria en via welk redeneerproces?
+Er is geen enkel correct antwoord. Dit deel dient uitsluitend om uw klinische benaderingslogica in kaart te brengen, zodat die naast die van PHOENIX kan worden geplaatst. Neem voldoende ruimte om uw redenering volledig en concreet te beschrijven.</w:t>
+            </w:r>
+          </w:p>
+        </w:tc>
+      </w:tr>
+    </w:tbl>
+    <w:tbl>
+      <w:tblPr>
+        <w:tblW w:w="9026" w:type="dxa"/>
+      </w:tblPr>
+      <w:tr>
+        <w:tc>
+          <w:tcPr>
+            <w:tcW w:w="9026" w:type="dxa"/>
+            <w:shd w:val="clear" w:color="auto" w:fill="FFFBEB"/>
+          </w:tcPr>
+          <w:p>
+            <w:r>
+              <w:rPr>
+                <w:b/>
+                <w:color w:val="B45309"/>
+                <w:sz w:val="20"/>
+              </w:rPr>
+              <w:t>Reflectievraag a</w:t>
+            </w:r>
+          </w:p>
+          <w:p>
+            <w:r>
+              <w:rPr>
+                <w:sz w:val="20"/>
+              </w:rPr>
+              <w:t xml:space="preserve">Welke informatie zou u via de dagelijkse EMA-vragen willen verzamelen voor deze specifieke casus, en op welke theoretische of klinische gronden?</w:t>
+            </w:r>
+          </w:p>
+          <w:p>
+            <w:r>
+              <w:rPr>
+                <w:b/>
+                <w:sz w:val="18"/>
+              </w:rPr>
+              <w:t xml:space="preserve">Uw antwoord:
+</w:t>
+            </w:r>
+            <w:r>
+              <w:t xml:space="preserve">________________________________________________________________________________
+________________________________________________________________________________
+________________________________________________________________________________
+________________________________________________________________________________
+________________________________________________________________________________</w:t>
+            </w:r>
+          </w:p>
+          <w:p>
+            <w:r>
+              <w:rPr>
+                <w:sz w:val="8"/>
+              </w:rPr>
+              <w:t xml:space="preserve"> </w:t>
+            </w:r>
+          </w:p>
+          <w:p>
+            <w:r>
+              <w:rPr>
+                <w:b/>
+                <w:color w:val="B45309"/>
+                <w:sz w:val="20"/>
+              </w:rPr>
+              <w:t>Reflectievraag b</w:t>
+            </w:r>
+          </w:p>
+          <w:p>
+            <w:r>
+              <w:rPr>
+                <w:sz w:val="20"/>
+              </w:rPr>
+              <w:t xml:space="preserve">Hoe zou u de dagelijkse boodschappen inhoudelijk afstemmen op de geselecteerde behandeldoelen en de individuele situatie van de client?</w:t>
+            </w:r>
+          </w:p>
+          <w:p>
+            <w:r>
+              <w:rPr>
+                <w:b/>
+                <w:sz w:val="18"/>
+              </w:rPr>
+              <w:t xml:space="preserve">Uw antwoord:
+</w:t>
+            </w:r>
+            <w:r>
+              <w:t xml:space="preserve">________________________________________________________________________________
+________________________________________________________________________________
+________________________________________________________________________________
+________________________________________________________________________________
+________________________________________________________________________________</w:t>
+            </w:r>
+          </w:p>
+          <w:p>
+            <w:r>
+              <w:rPr>
+                <w:sz w:val="8"/>
+              </w:rPr>
+              <w:t xml:space="preserve"> </w:t>
+            </w:r>
+          </w:p>
+          <w:p>
+            <w:r>
+              <w:rPr>
+                <w:b/>
+                <w:color w:val="B45309"/>
+                <w:sz w:val="20"/>
+              </w:rPr>
+              <w:t>Reflectievraag c</w:t>
+            </w:r>
+          </w:p>
+          <w:p>
+            <w:r>
+              <w:rPr>
+                <w:sz w:val="20"/>
+              </w:rPr>
+              <w:t xml:space="preserve">Zou u uw digitale aanpak systematisch bijsturen naarmate meer data beschikbaar wordt? Zo ja, op welke manier en aan de hand van welke criteria?</w:t>
+            </w:r>
+          </w:p>
+          <w:p>
+            <w:r>
+              <w:rPr>
+                <w:b/>
+                <w:sz w:val="18"/>
+              </w:rPr>
+              <w:t xml:space="preserve">Uw antwoord:
+</w:t>
+            </w:r>
+            <w:r>
+              <w:t xml:space="preserve">________________________________________________________________________________
+________________________________________________________________________________
+________________________________________________________________________________
+________________________________________________________________________________
+________________________________________________________________________________</w:t>
+            </w:r>
+          </w:p>
+        </w:tc>
+      </w:tr>
+    </w:tbl>
     <w:p>
       <w:r>
         <w:br w:type="page"/>
@@ -4625,7 +4762,7 @@
           <w:color w:val="000000"/>
           <w:sz w:val="22"/>
         </w:rPr>
-        <w:t>Dank u voor het invullen van alle vijf delen voor uw toegewezen casus.</w:t>
+        <w:t>Dank u voor het invullen van alle zes delen voor uw toegewezen casus en de afsluitende reflectievraag.</w:t>
       </w:r>
     </w:p>
     <w:tbl>
@@ -4709,6 +4846,104 @@
                 <w:sz w:val="19"/>
               </w:rPr>
               <w:t>☐  Ik heb in Deel 5 een mobiele coachingsboodschap geschreven.</w:t>
+            </w:r>
+          </w:p>
+          <w:p>
+            <w:pPr>
+              <w:spacing w:before="0" w:after="20"/>
+            </w:pPr>
+            <w:r>
+              <w:rPr>
+                <w:sz w:val="19"/>
+              </w:rPr>
+              <w:t>☐  Mijn antwoorden weerspiegelen mijn eigen klinische oordeel zonder gebruik van generatieve AI of andere externe hulp.</w:t>
+            </w:r>
+          </w:p>
+          <w:p>
+            <w:pPr>
+              <w:spacing w:before="0" w:after="20"/>
+            </w:pPr>
+            <w:r>
+              <w:rPr>
+                <w:sz w:val="19"/>
+              </w:rPr>
+              <w:t>☐  Ik begrijp dat mijn antwoorden geanonimiseerd worden voor analyse.</w:t>
+            </w:r>
+          </w:p>
+        </w:tc>
+      </w:tr>
+      <w:tr>
+        <w:tc>
+          <w:tcPr>
+            <w:tcW w:type="dxa" w:w="9746"/>
+            <w:shd w:val="clear" w:color="auto" w:fill="E8F0FE"/>
+          </w:tcPr>
+          <w:p>
+            <w:pPr>
+              <w:spacing w:before="40" w:after="60"/>
+            </w:pPr>
+            <w:r>
+              <w:rPr>
+                <w:b/>
+                <w:color w:val="475569"/>
+                <w:sz w:val="20"/>
+              </w:rPr>
+              <w:t>Checklist voor terugbezorging</w:t>
+            </w:r>
+          </w:p>
+          <w:p>
+            <w:pPr>
+              <w:spacing w:before="0" w:after="20"/>
+            </w:pPr>
+            <w:r>
+              <w:rPr>
+                <w:sz w:val="19"/>
+              </w:rPr>
+              <w:t>☐  Ik heb in Deel 1 symptoomlabels ingevuld.</w:t>
+            </w:r>
+          </w:p>
+          <w:p>
+            <w:pPr>
+              <w:spacing w:before="0" w:after="20"/>
+            </w:pPr>
+            <w:r>
+              <w:rPr>
+                <w:sz w:val="19"/>
+              </w:rPr>
+              <w:t>☐  Ik heb in Deel 2 behandelingsoptielabels ingevuld.</w:t>
+            </w:r>
+          </w:p>
+          <w:p>
+            <w:pPr>
+              <w:spacing w:before="0" w:after="20"/>
+            </w:pPr>
+            <w:r>
+              <w:rPr>
+                <w:sz w:val="19"/>
+              </w:rPr>
+              <w:t>☐  Ik heb in Deel 3 alle 5 behandelingsopties gerangschikt.</w:t>
+            </w:r>
+          </w:p>
+          <w:p>
+            <w:pPr>
+              <w:spacing w:before="0" w:after="20"/>
+            </w:pPr>
+            <w:r>
+              <w:rPr>
+                <w:sz w:val="19"/>
+              </w:rPr>
+              <w:t>☐  Ik heb in Deel 4 exact 6 EMA-items geselecteerd.</w:t>
+            </w:r>
+          </w:p>
+          <w:p>
+            <w:pPr>
+              <w:spacing w:before="0" w:after="20"/>
+            </w:pPr>
+            <w:r>
+              <w:rPr>
+                <w:sz w:val="19"/>
+              </w:rPr>
+              <w:t>☐  Ik heb in Deel 6 de reflectievraag over digitale benaderingslogica beantwoord.</w:t>
             </w:r>
           </w:p>
           <w:p>

</xml_diff>

<commit_message>
HCP PRE 1-case DOCX: fix duplicate 'Uw antwoord' in Deel 5 and Deel 6 answer boxes
- Deel 5: shorten title to 'Uw antwoord – Deel 5' (drop ': coachingsboodschap')
- Deel 6: rename section headers 'Reflectievraag a/b/c' → 'Uw antwoord – Reflectievraag a/b/c'
- Deel 6: remove mistakenly added 'Uw antwoord:' label inside underline paragraphs

Co-Authored-By: Claude Sonnet 4.6 <noreply@anthropic.com>
</commit_message>
<xml_diff>
--- a/evaluation/qualtrics/01_HCPs_PRE/separate_HCPs/1_case_per_HCP/HCP_01/main.docx
+++ b/evaluation/qualtrics/01_HCPs_PRE/separate_HCPs/1_case_per_HCP/HCP_01/main.docx
@@ -4485,7 +4485,7 @@
                 <w:color w:val="6D28D9"/>
                 <w:sz w:val="20"/>
               </w:rPr>
-              <w:t>Uw antwoord – Deel 5: coachingsboodschap</w:t>
+              <w:t>Uw antwoord – Deel 5</w:t>
             </w:r>
           </w:p>
           <w:p>
@@ -4617,7 +4617,7 @@
                 <w:color w:val="B45309"/>
                 <w:sz w:val="20"/>
               </w:rPr>
-              <w:t>Reflectievraag a</w:t>
+              <w:t>Uw antwoord – Reflectievraag a</w:t>
             </w:r>
           </w:p>
           <w:p>
@@ -4629,14 +4629,6 @@
             </w:r>
           </w:p>
           <w:p>
-            <w:r>
-              <w:rPr>
-                <w:b/>
-                <w:sz w:val="18"/>
-              </w:rPr>
-              <w:t xml:space="preserve">Uw antwoord:
-</w:t>
-            </w:r>
             <w:r>
               <w:t xml:space="preserve">________________________________________________________________________________
 ________________________________________________________________________________
@@ -4660,7 +4652,7 @@
                 <w:color w:val="B45309"/>
                 <w:sz w:val="20"/>
               </w:rPr>
-              <w:t>Reflectievraag b</w:t>
+              <w:t>Uw antwoord – Reflectievraag b</w:t>
             </w:r>
           </w:p>
           <w:p>
@@ -4672,14 +4664,6 @@
             </w:r>
           </w:p>
           <w:p>
-            <w:r>
-              <w:rPr>
-                <w:b/>
-                <w:sz w:val="18"/>
-              </w:rPr>
-              <w:t xml:space="preserve">Uw antwoord:
-</w:t>
-            </w:r>
             <w:r>
               <w:t xml:space="preserve">________________________________________________________________________________
 ________________________________________________________________________________
@@ -4703,7 +4687,7 @@
                 <w:color w:val="B45309"/>
                 <w:sz w:val="20"/>
               </w:rPr>
-              <w:t>Reflectievraag c</w:t>
+              <w:t>Uw antwoord – Reflectievraag c</w:t>
             </w:r>
           </w:p>
           <w:p>
@@ -4715,14 +4699,6 @@
             </w:r>
           </w:p>
           <w:p>
-            <w:r>
-              <w:rPr>
-                <w:b/>
-                <w:sz w:val="18"/>
-              </w:rPr>
-              <w:t xml:space="preserve">Uw antwoord:
-</w:t>
-            </w:r>
             <w:r>
               <w:t xml:space="preserve">________________________________________________________________________________
 ________________________________________________________________________________

</xml_diff>